<commit_message>
Name WSJF on the prioritisation board; add estimation and prioritisation terms
- Cost of Delay panel labelled WSJF (SAFe's name for CD3), column-by-column
  scoring instruction, "Job size" column; guide explains WSJF, adds the
  common scoring pitfall and a RICE / Kano tip
- ROAM tips in the RAID Log and Cross-Team Planning guides; Kano tip in
  the Product Vision guide
- Glossary adds WSJF, planning poker, story points, ROAM, RICE, Kano,
  MoSCoW and delegation poker (55 terms)

Co-Authored-By: Claude Opus 5.5 <noreply@anthropic.com>
</commit_message>
<xml_diff>
--- a/facilitator-guide-cross-team-planning.docx
+++ b/facilitator-guide-cross-team-planning.docx
@@ -740,6 +740,18 @@
       </w:pPr>
       <w:r>
         <w:t xml:space="preserve">Each has an owner and response</w:t>
+      </w:r>
+    </w:p>
+    <w:p>
+      <w:pPr>
+        <w:pStyle w:val="ListBullet"/>
+        <w:numPr>
+          <w:ilvl w:val="0"/>
+          <w:numId w:val="1"/>
+        </w:numPr>
+      </w:pPr>
+      <w:r>
+        <w:t xml:space="preserve">Sort them ROAM: resolved, owned, accepted, mitigated</w:t>
       </w:r>
     </w:p>
     <w:p>

</xml_diff>